<commit_message>
Corrección de la llamada a funciones y actualización de gráficos
</commit_message>
<xml_diff>
--- a/NotaEcoinformatica_Revision_Repositorios.docx
+++ b/NotaEcoinformatica_Revision_Repositorios.docx
@@ -1426,39 +1426,7 @@
           <w:rStyle w:val="VerbatimChar"/>
           <w:lang w:val="es-ES"/>
         </w:rPr>
-        <w:t>('</w:t>
-      </w:r>
-      <w:proofErr w:type="spellStart"/>
-      <w:r>
-        <w:rPr>
-          <w:rStyle w:val="VerbatimChar"/>
-          <w:lang w:val="es-ES"/>
-        </w:rPr>
-        <w:t>Documentos_Word</w:t>
-      </w:r>
-      <w:proofErr w:type="spellEnd"/>
-      <w:r>
-        <w:rPr>
-          <w:rStyle w:val="VerbatimChar"/>
-          <w:lang w:val="es-ES"/>
-        </w:rPr>
-        <w:t>/</w:t>
-      </w:r>
-      <w:proofErr w:type="spellStart"/>
-      <w:r>
-        <w:rPr>
-          <w:rStyle w:val="VerbatimChar"/>
-          <w:lang w:val="es-ES"/>
-        </w:rPr>
-        <w:t>carpeta_docs_claudia</w:t>
-      </w:r>
-      <w:proofErr w:type="spellEnd"/>
-      <w:r>
-        <w:rPr>
-          <w:rStyle w:val="VerbatimChar"/>
-          <w:lang w:val="es-ES"/>
-        </w:rPr>
-        <w:t>/</w:t>
+        <w:t>('R/</w:t>
       </w:r>
       <w:proofErr w:type="spellStart"/>
       <w:r>
@@ -2061,12 +2029,37 @@
         </w:rPr>
         <w:br/>
       </w:r>
-      <w:r>
-        <w:rPr>
-          <w:rStyle w:val="VerbatimChar"/>
-          <w:lang w:val="es-ES"/>
-        </w:rPr>
-        <w:t>source('Documentos_Word/carpeta_docs_claudia/consulta_Bioconductor.R')</w:t>
+      <w:proofErr w:type="spellStart"/>
+      <w:r>
+        <w:rPr>
+          <w:rStyle w:val="VerbatimChar"/>
+          <w:lang w:val="es-ES"/>
+        </w:rPr>
+        <w:t>source</w:t>
+      </w:r>
+      <w:proofErr w:type="spellEnd"/>
+      <w:r>
+        <w:rPr>
+          <w:rStyle w:val="VerbatimChar"/>
+          <w:lang w:val="es-ES"/>
+        </w:rPr>
+        <w:t>('R/</w:t>
+      </w:r>
+      <w:proofErr w:type="spellStart"/>
+      <w:r>
+        <w:rPr>
+          <w:rStyle w:val="VerbatimChar"/>
+          <w:lang w:val="es-ES"/>
+        </w:rPr>
+        <w:t>consulta_Bioconductor.R</w:t>
+      </w:r>
+      <w:proofErr w:type="spellEnd"/>
+      <w:r>
+        <w:rPr>
+          <w:rStyle w:val="VerbatimChar"/>
+          <w:lang w:val="es-ES"/>
+        </w:rPr>
+        <w:t>')</w:t>
       </w:r>
       <w:r>
         <w:rPr>
@@ -2950,39 +2943,7 @@
           <w:rStyle w:val="VerbatimChar"/>
           <w:lang w:val="es-ES"/>
         </w:rPr>
-        <w:t>('</w:t>
-      </w:r>
-      <w:proofErr w:type="spellStart"/>
-      <w:r>
-        <w:rPr>
-          <w:rStyle w:val="VerbatimChar"/>
-          <w:lang w:val="es-ES"/>
-        </w:rPr>
-        <w:t>Documentos_Word</w:t>
-      </w:r>
-      <w:proofErr w:type="spellEnd"/>
-      <w:r>
-        <w:rPr>
-          <w:rStyle w:val="VerbatimChar"/>
-          <w:lang w:val="es-ES"/>
-        </w:rPr>
-        <w:t>/</w:t>
-      </w:r>
-      <w:proofErr w:type="spellStart"/>
-      <w:r>
-        <w:rPr>
-          <w:rStyle w:val="VerbatimChar"/>
-          <w:lang w:val="es-ES"/>
-        </w:rPr>
-        <w:t>carpeta_docs_claudia</w:t>
-      </w:r>
-      <w:proofErr w:type="spellEnd"/>
-      <w:r>
-        <w:rPr>
-          <w:rStyle w:val="VerbatimChar"/>
-          <w:lang w:val="es-ES"/>
-        </w:rPr>
-        <w:t>/</w:t>
+        <w:t>('R/</w:t>
       </w:r>
       <w:proofErr w:type="spellStart"/>
       <w:r>
@@ -4176,7 +4137,7 @@
           <w:noProof/>
         </w:rPr>
         <w:drawing>
-          <wp:inline distT="0" distB="0" distL="0" distR="0" wp14:anchorId="0E16F481" wp14:editId="21AEA3F3">
+          <wp:inline distT="0" distB="0" distL="0" distR="0" wp14:anchorId="2D177523" wp14:editId="77F591C2">
             <wp:extent cx="5727700" cy="4582159"/>
             <wp:effectExtent l="0" t="0" r="0" b="0"/>
             <wp:docPr id="56" name="Picture" descr="Figura 1. Estadísticas básicas obtenidas de la búsqueda en el repositorio CRAN"/>
@@ -4185,7 +4146,7 @@
               <a:graphicData uri="http://schemas.openxmlformats.org/drawingml/2006/picture">
                 <pic:pic xmlns:pic="http://schemas.openxmlformats.org/drawingml/2006/picture">
                   <pic:nvPicPr>
-                    <pic:cNvPr id="57" name="Picture" descr="nota_eco_Claudia_files/figure-docx/fig1-1.png"/>
+                    <pic:cNvPr id="57" name="Picture" descr="NotaEcoinformatica_Revision_Repositorios_files/figure-docx/fig1-1.png"/>
                     <pic:cNvPicPr>
                       <a:picLocks noChangeAspect="1" noChangeArrowheads="1"/>
                     </pic:cNvPicPr>
@@ -4249,7 +4210,7 @@
           <w:noProof/>
         </w:rPr>
         <w:drawing>
-          <wp:inline distT="0" distB="0" distL="0" distR="0" wp14:anchorId="43D465C3" wp14:editId="4650C46E">
+          <wp:inline distT="0" distB="0" distL="0" distR="0" wp14:anchorId="22E5BBB6" wp14:editId="625EEEE3">
             <wp:extent cx="4868545" cy="3894835"/>
             <wp:effectExtent l="0" t="0" r="0" b="0"/>
             <wp:docPr id="60" name="Picture" descr="Figura 2. Gráfico de dependencias (grafo) del paquete CircSeqAlignTk"/>
@@ -4258,7 +4219,7 @@
               <a:graphicData uri="http://schemas.openxmlformats.org/drawingml/2006/picture">
                 <pic:pic xmlns:pic="http://schemas.openxmlformats.org/drawingml/2006/picture">
                   <pic:nvPicPr>
-                    <pic:cNvPr id="61" name="Picture" descr="nota_eco_Claudia_files/figure-docx/Fig2-1.png"/>
+                    <pic:cNvPr id="61" name="Picture" descr="NotaEcoinformatica_Revision_Repositorios_files/figure-docx/Fig2-1.png"/>
                     <pic:cNvPicPr>
                       <a:picLocks noChangeAspect="1" noChangeArrowheads="1"/>
                     </pic:cNvPicPr>
@@ -4330,7 +4291,7 @@
           <w:noProof/>
         </w:rPr>
         <w:drawing>
-          <wp:inline distT="0" distB="0" distL="0" distR="0" wp14:anchorId="238C7A97" wp14:editId="5F47C965">
+          <wp:inline distT="0" distB="0" distL="0" distR="0" wp14:anchorId="6EFF5606" wp14:editId="54942308">
             <wp:extent cx="4868545" cy="3894835"/>
             <wp:effectExtent l="0" t="0" r="0" b="0"/>
             <wp:docPr id="64" name="Picture" descr="Figura 3. Variación temporal de los repositorios consultados y su calificación en número de estrellas (log10)"/>
@@ -4339,7 +4300,7 @@
               <a:graphicData uri="http://schemas.openxmlformats.org/drawingml/2006/picture">
                 <pic:pic xmlns:pic="http://schemas.openxmlformats.org/drawingml/2006/picture">
                   <pic:nvPicPr>
-                    <pic:cNvPr id="65" name="Picture" descr="nota_eco_Claudia_files/figure-docx/Fig3-1.png"/>
+                    <pic:cNvPr id="65" name="Picture" descr="NotaEcoinformatica_Revision_Repositorios_files/figure-docx/Fig3-1.png"/>
                     <pic:cNvPicPr>
                       <a:picLocks noChangeAspect="1" noChangeArrowheads="1"/>
                     </pic:cNvPicPr>
@@ -4893,7 +4854,7 @@
   <w:abstractNum w:abstractNumId="8" w15:restartNumberingAfterBreak="0">
     <w:nsid w:val="0000A990"/>
     <w:multiLevelType w:val="multilevel"/>
-    <w:tmpl w:val="0AF6FD84"/>
+    <w:tmpl w:val="3F66B728"/>
     <w:lvl w:ilvl="0">
       <w:numFmt w:val="bullet"/>
       <w:lvlText w:val=" "/>
@@ -4970,7 +4931,7 @@
   <w:abstractNum w:abstractNumId="9" w15:restartNumberingAfterBreak="0">
     <w:nsid w:val="0000A991"/>
     <w:multiLevelType w:val="multilevel"/>
-    <w:tmpl w:val="A14EBDE2"/>
+    <w:tmpl w:val="EA16EDE0"/>
     <w:lvl w:ilvl="0">
       <w:numFmt w:val="bullet"/>
       <w:lvlText w:val=""/>
@@ -5074,7 +5035,7 @@
   <w:abstractNum w:abstractNumId="10" w15:restartNumberingAfterBreak="0">
     <w:nsid w:val="00A99411"/>
     <w:multiLevelType w:val="multilevel"/>
-    <w:tmpl w:val="5554D8BC"/>
+    <w:tmpl w:val="99781E04"/>
     <w:lvl w:ilvl="0">
       <w:start w:val="1"/>
       <w:numFmt w:val="decimal"/>
@@ -5160,7 +5121,7 @@
   <w:abstractNum w:abstractNumId="11" w15:restartNumberingAfterBreak="0">
     <w:nsid w:val="00A99412"/>
     <w:multiLevelType w:val="multilevel"/>
-    <w:tmpl w:val="3D240248"/>
+    <w:tmpl w:val="30549006"/>
     <w:lvl w:ilvl="0">
       <w:start w:val="2"/>
       <w:numFmt w:val="decimal"/>
@@ -5246,7 +5207,7 @@
   <w:abstractNum w:abstractNumId="12" w15:restartNumberingAfterBreak="0">
     <w:nsid w:val="00A99413"/>
     <w:multiLevelType w:val="multilevel"/>
-    <w:tmpl w:val="A79CA61A"/>
+    <w:tmpl w:val="A920CA84"/>
     <w:lvl w:ilvl="0">
       <w:start w:val="3"/>
       <w:numFmt w:val="decimal"/>
@@ -5332,7 +5293,7 @@
   <w:abstractNum w:abstractNumId="13" w15:restartNumberingAfterBreak="0">
     <w:nsid w:val="00A99414"/>
     <w:multiLevelType w:val="multilevel"/>
-    <w:tmpl w:val="FD3C7C16"/>
+    <w:tmpl w:val="1CB6F7A8"/>
     <w:lvl w:ilvl="0">
       <w:start w:val="4"/>
       <w:numFmt w:val="decimal"/>
@@ -5418,7 +5379,7 @@
   <w:abstractNum w:abstractNumId="14" w15:restartNumberingAfterBreak="0">
     <w:nsid w:val="00A99415"/>
     <w:multiLevelType w:val="multilevel"/>
-    <w:tmpl w:val="51BCF51A"/>
+    <w:tmpl w:val="A3FC6620"/>
     <w:lvl w:ilvl="0">
       <w:start w:val="5"/>
       <w:numFmt w:val="decimal"/>
@@ -5504,7 +5465,7 @@
   <w:abstractNum w:abstractNumId="15" w15:restartNumberingAfterBreak="0">
     <w:nsid w:val="00A99431"/>
     <w:multiLevelType w:val="multilevel"/>
-    <w:tmpl w:val="60FC1200"/>
+    <w:tmpl w:val="CBD8B908"/>
     <w:lvl w:ilvl="0">
       <w:start w:val="1"/>
       <w:numFmt w:val="decimal"/>
@@ -6068,16 +6029,16 @@
       <w:lvlJc w:val="left"/>
     </w:lvl>
   </w:abstractNum>
-  <w:num w:numId="1" w16cid:durableId="1613046988">
+  <w:num w:numId="1" w16cid:durableId="1118521645">
     <w:abstractNumId w:val="1"/>
   </w:num>
-  <w:num w:numId="2" w16cid:durableId="830294623">
+  <w:num w:numId="2" w16cid:durableId="2088574945">
     <w:abstractNumId w:val="19"/>
   </w:num>
-  <w:num w:numId="3" w16cid:durableId="1499881142">
+  <w:num w:numId="3" w16cid:durableId="1010448091">
     <w:abstractNumId w:val="0"/>
   </w:num>
-  <w:num w:numId="4" w16cid:durableId="1719934249">
+  <w:num w:numId="4" w16cid:durableId="1636715869">
     <w:abstractNumId w:val="2"/>
     <w:lvlOverride w:ilvl="0">
       <w:startOverride w:val="1"/>
@@ -6101,10 +6062,10 @@
       <w:startOverride w:val="1"/>
     </w:lvlOverride>
   </w:num>
-  <w:num w:numId="5" w16cid:durableId="973826398">
+  <w:num w:numId="5" w16cid:durableId="128326993">
     <w:abstractNumId w:val="18"/>
   </w:num>
-  <w:num w:numId="6" w16cid:durableId="1161315190">
+  <w:num w:numId="6" w16cid:durableId="1619295744">
     <w:abstractNumId w:val="16"/>
     <w:lvlOverride w:ilvl="0">
       <w:startOverride w:val="1"/>
@@ -6128,7 +6089,7 @@
       <w:startOverride w:val="1"/>
     </w:lvlOverride>
   </w:num>
-  <w:num w:numId="7" w16cid:durableId="1231160169">
+  <w:num w:numId="7" w16cid:durableId="1164273452">
     <w:abstractNumId w:val="17"/>
     <w:lvlOverride w:ilvl="0">
       <w:startOverride w:val="2"/>
@@ -6152,7 +6113,7 @@
       <w:startOverride w:val="2"/>
     </w:lvlOverride>
   </w:num>
-  <w:num w:numId="8" w16cid:durableId="509837305">
+  <w:num w:numId="8" w16cid:durableId="571358711">
     <w:abstractNumId w:val="20"/>
     <w:lvlOverride w:ilvl="0">
       <w:startOverride w:val="3"/>
@@ -6176,25 +6137,25 @@
       <w:startOverride w:val="3"/>
     </w:lvlOverride>
   </w:num>
-  <w:num w:numId="9" w16cid:durableId="1771701897">
+  <w:num w:numId="9" w16cid:durableId="890338468">
     <w:abstractNumId w:val="7"/>
   </w:num>
-  <w:num w:numId="10" w16cid:durableId="891617803">
+  <w:num w:numId="10" w16cid:durableId="1398280240">
     <w:abstractNumId w:val="6"/>
   </w:num>
-  <w:num w:numId="11" w16cid:durableId="469829026">
+  <w:num w:numId="11" w16cid:durableId="1663386777">
     <w:abstractNumId w:val="5"/>
   </w:num>
-  <w:num w:numId="12" w16cid:durableId="526912065">
+  <w:num w:numId="12" w16cid:durableId="1216429058">
     <w:abstractNumId w:val="4"/>
   </w:num>
-  <w:num w:numId="13" w16cid:durableId="1435127861">
+  <w:num w:numId="13" w16cid:durableId="632488011">
     <w:abstractNumId w:val="3"/>
   </w:num>
-  <w:num w:numId="14" w16cid:durableId="820194115">
+  <w:num w:numId="14" w16cid:durableId="951395452">
     <w:abstractNumId w:val="8"/>
   </w:num>
-  <w:num w:numId="15" w16cid:durableId="85537342">
+  <w:num w:numId="15" w16cid:durableId="748817508">
     <w:abstractNumId w:val="15"/>
     <w:lvlOverride w:ilvl="0">
       <w:startOverride w:val="1"/>
@@ -6224,10 +6185,10 @@
       <w:startOverride w:val="1"/>
     </w:lvlOverride>
   </w:num>
-  <w:num w:numId="16" w16cid:durableId="1898011850">
+  <w:num w:numId="16" w16cid:durableId="599875844">
     <w:abstractNumId w:val="9"/>
   </w:num>
-  <w:num w:numId="17" w16cid:durableId="437718011">
+  <w:num w:numId="17" w16cid:durableId="1605385000">
     <w:abstractNumId w:val="10"/>
     <w:lvlOverride w:ilvl="0">
       <w:startOverride w:val="1"/>
@@ -6257,7 +6218,7 @@
       <w:startOverride w:val="1"/>
     </w:lvlOverride>
   </w:num>
-  <w:num w:numId="18" w16cid:durableId="895317068">
+  <w:num w:numId="18" w16cid:durableId="1399401470">
     <w:abstractNumId w:val="11"/>
     <w:lvlOverride w:ilvl="0">
       <w:startOverride w:val="2"/>
@@ -6287,7 +6248,7 @@
       <w:startOverride w:val="2"/>
     </w:lvlOverride>
   </w:num>
-  <w:num w:numId="19" w16cid:durableId="428283435">
+  <w:num w:numId="19" w16cid:durableId="1195581723">
     <w:abstractNumId w:val="12"/>
     <w:lvlOverride w:ilvl="0">
       <w:startOverride w:val="3"/>
@@ -6317,7 +6278,7 @@
       <w:startOverride w:val="3"/>
     </w:lvlOverride>
   </w:num>
-  <w:num w:numId="20" w16cid:durableId="1976838844">
+  <w:num w:numId="20" w16cid:durableId="1020351069">
     <w:abstractNumId w:val="13"/>
     <w:lvlOverride w:ilvl="0">
       <w:startOverride w:val="4"/>
@@ -6347,7 +6308,7 @@
       <w:startOverride w:val="4"/>
     </w:lvlOverride>
   </w:num>
-  <w:num w:numId="21" w16cid:durableId="1206796717">
+  <w:num w:numId="21" w16cid:durableId="1530992332">
     <w:abstractNumId w:val="14"/>
     <w:lvlOverride w:ilvl="0">
       <w:startOverride w:val="5"/>
@@ -6377,7 +6338,7 @@
       <w:startOverride w:val="5"/>
     </w:lvlOverride>
   </w:num>
-  <w:num w:numId="22" w16cid:durableId="474641144">
+  <w:num w:numId="22" w16cid:durableId="673188590">
     <w:abstractNumId w:val="9"/>
   </w:num>
 </w:numbering>

</xml_diff>

<commit_message>
Figura 3 y word final
</commit_message>
<xml_diff>
--- a/NotaEcoinformatica_Revision_Repositorios.docx
+++ b/NotaEcoinformatica_Revision_Repositorios.docx
@@ -2262,52 +2262,84 @@
         <w:t xml:space="preserve">Figure 1</w:t>
       </w:r>
       <w:r>
-        <w:t xml:space="preserve">. Basic statistics obtained from CRAN repository search (downloads, date and activity).</w:t>
-      </w:r>
-    </w:p>
-    <w:p>
-      <w:pPr>
-        <w:pStyle w:val="BodyText"/>
-      </w:pPr>
+        <w:t xml:space="preserve">. Statistics obtained from the query on the CRAN repository;</w:t>
+      </w:r>
+      <w:r>
+        <w:t xml:space="preserve"> </w:t>
+      </w:r>
       <w:r>
         <w:rPr>
           <w:b/>
           <w:bCs/>
         </w:rPr>
-        <w:t xml:space="preserve">Figure 2</w:t>
-      </w:r>
-      <w:r>
-        <w:t xml:space="preserve">. Graph representation of the dependency relationships of the</w:t>
-      </w:r>
-      <w:r>
-        <w:t xml:space="preserve"> </w:t>
-      </w:r>
-      <w:r>
-        <w:rPr>
-          <w:rStyle w:val="VerbatimChar"/>
-        </w:rPr>
-        <w:t xml:space="preserve">CircSeqAlignTk</w:t>
-      </w:r>
-      <w:r>
-        <w:t xml:space="preserve"> </w:t>
-      </w:r>
-      <w:r>
-        <w:t xml:space="preserve">package.</w:t>
-      </w:r>
-    </w:p>
-    <w:p>
-      <w:pPr>
-        <w:pStyle w:val="BodyText"/>
-      </w:pPr>
+        <w:t xml:space="preserve">a)</w:t>
+      </w:r>
+      <w:r>
+        <w:t xml:space="preserve"> </w:t>
+      </w:r>
+      <w:r>
+        <w:t xml:space="preserve">number of packages published per year and</w:t>
+      </w:r>
+      <w:r>
+        <w:t xml:space="preserve"> </w:t>
+      </w:r>
       <w:r>
         <w:rPr>
           <w:b/>
           <w:bCs/>
         </w:rPr>
+        <w:t xml:space="preserve">b)</w:t>
+      </w:r>
+      <w:r>
+        <w:t xml:space="preserve"> </w:t>
+      </w:r>
+      <w:r>
+        <w:t xml:space="preserve">number of downloads of the queried packages from CRAN.</w:t>
+      </w:r>
+    </w:p>
+    <w:p>
+      <w:pPr>
+        <w:pStyle w:val="BodyText"/>
+      </w:pPr>
+      <w:r>
+        <w:rPr>
+          <w:b/>
+          <w:bCs/>
+        </w:rPr>
+        <w:t xml:space="preserve">Figure 2</w:t>
+      </w:r>
+      <w:r>
+        <w:t xml:space="preserve">. Graph representation of the dependency relationships of the</w:t>
+      </w:r>
+      <w:r>
+        <w:t xml:space="preserve"> </w:t>
+      </w:r>
+      <w:r>
+        <w:rPr>
+          <w:rStyle w:val="VerbatimChar"/>
+        </w:rPr>
+        <w:t xml:space="preserve">CircSeqAlignTk</w:t>
+      </w:r>
+      <w:r>
+        <w:t xml:space="preserve"> </w:t>
+      </w:r>
+      <w:r>
+        <w:t xml:space="preserve">package.</w:t>
+      </w:r>
+    </w:p>
+    <w:p>
+      <w:pPr>
+        <w:pStyle w:val="BodyText"/>
+      </w:pPr>
+      <w:r>
+        <w:rPr>
+          <w:b/>
+          <w:bCs/>
+        </w:rPr>
         <w:t xml:space="preserve">Figure 3</w:t>
       </w:r>
       <w:r>
-        <w:t xml:space="preserve">. Relationship between the repositories’ creation date and their star rating (log10).</w:t>
+        <w:t xml:space="preserve">. Relationship between the creation date of the queried repositories and their rating in (log10) number of stars.</w:t>
       </w:r>
     </w:p>
     <w:bookmarkEnd w:id="67"/>
@@ -2441,7 +2473,7 @@
       <w:r>
         <w:drawing>
           <wp:inline>
-            <wp:extent cx="4868545" cy="3894835"/>
+            <wp:extent cx="4009390" cy="5011737"/>
             <wp:effectExtent b="0" l="0" r="0" t="0"/>
             <wp:docPr descr="" title="" id="77" name="Picture"/>
             <a:graphic>
@@ -2462,7 +2494,7 @@
                   <pic:spPr bwMode="auto">
                     <a:xfrm>
                       <a:off x="0" y="0"/>
-                      <a:ext cx="4868545" cy="3894835"/>
+                      <a:ext cx="4009390" cy="5011737"/>
                     </a:xfrm>
                     <a:prstGeom prst="rect">
                       <a:avLst/>

</xml_diff>